<commit_message>
Edits and comments to intro
</commit_message>
<xml_diff>
--- a/Documents /MS Thesis Intro..docx
+++ b/Documents /MS Thesis Intro..docx
@@ -157,7 +157,112 @@
         <w:br/>
       </w:r>
       <w:r>
-        <w:t xml:space="preserve">Birds are among the most well-studied classes in the animal kingdom- filling critical roles in ecosystems worldwide through mechanisms such as insect control, pollination, seed dispersal and more. Despite their ecological value and breadth of study, key gaps in avian ecology, particularly at the human-wildlife interface, remain unexplored. Urbanization and anthropogenic activities continue to change natural landscapes in the Southeast United States, creating new opportunities for wildlife, people, and domestic animals to interact with one another in proximity. As activities like backyard bird-feeding and small-scale poultry become more popularized, the responsibility of satisfying the lack of knowledge and research becomes greater. </w:t>
+        <w:t>Birds are among the most well-studied</w:t>
+      </w:r>
+      <w:ins w:id="0" w:author="Kelsey McCune" w:date="2026-03-24T08:10:00Z" w16du:dateUtc="2026-03-24T13:10:00Z">
+        <w:r>
+          <w:t xml:space="preserve"> and widespread</w:t>
+        </w:r>
+      </w:ins>
+      <w:r>
+        <w:t xml:space="preserve"> </w:t>
+      </w:r>
+      <w:del w:id="1" w:author="Kelsey McCune" w:date="2026-03-24T08:09:00Z" w16du:dateUtc="2026-03-24T13:09:00Z">
+        <w:r>
+          <w:delText xml:space="preserve">classes </w:delText>
+        </w:r>
+      </w:del>
+      <w:ins w:id="2" w:author="Kelsey McCune" w:date="2026-03-24T08:09:00Z" w16du:dateUtc="2026-03-24T13:09:00Z">
+        <w:r>
+          <w:t>taxa</w:t>
+        </w:r>
+        <w:r>
+          <w:t xml:space="preserve"> </w:t>
+        </w:r>
+      </w:ins>
+      <w:r>
+        <w:t>in the animal kingdom</w:t>
+      </w:r>
+      <w:ins w:id="3" w:author="Kelsey McCune" w:date="2026-03-24T08:09:00Z" w16du:dateUtc="2026-03-24T13:09:00Z">
+        <w:r>
+          <w:t>,</w:t>
+        </w:r>
+      </w:ins>
+      <w:del w:id="4" w:author="Kelsey McCune" w:date="2026-03-24T08:09:00Z" w16du:dateUtc="2026-03-24T13:09:00Z">
+        <w:r>
+          <w:delText>-</w:delText>
+        </w:r>
+      </w:del>
+      <w:r>
+        <w:t xml:space="preserve"> filling critical roles in ecosystems worldwide through mechanisms such as insect control, pollination, seed dispersal and more. Despite their ecological value and breadth of study, key gaps in avian ecology</w:t>
+      </w:r>
+      <w:del w:id="5" w:author="Kelsey McCune" w:date="2026-03-24T08:12:00Z" w16du:dateUtc="2026-03-24T13:12:00Z">
+        <w:r>
+          <w:delText xml:space="preserve">, particularly </w:delText>
+        </w:r>
+        <w:commentRangeStart w:id="6"/>
+        <w:r>
+          <w:delText>at the human-wildlife interface</w:delText>
+        </w:r>
+        <w:commentRangeEnd w:id="6"/>
+        <w:r>
+          <w:rPr>
+            <w:rStyle w:val="CommentReference"/>
+          </w:rPr>
+          <w:commentReference w:id="6"/>
+        </w:r>
+        <w:r>
+          <w:delText xml:space="preserve">, </w:delText>
+        </w:r>
+      </w:del>
+      <w:ins w:id="7" w:author="Kelsey McCune" w:date="2026-03-24T08:12:00Z" w16du:dateUtc="2026-03-24T13:12:00Z">
+        <w:r>
+          <w:t xml:space="preserve"> </w:t>
+        </w:r>
+      </w:ins>
+      <w:r>
+        <w:t xml:space="preserve">remain unexplored. Urbanization and anthropogenic activities continue to change natural landscapes in the </w:t>
+      </w:r>
+      <w:commentRangeStart w:id="8"/>
+      <w:r>
+        <w:t>Southeast United States</w:t>
+      </w:r>
+      <w:commentRangeEnd w:id="8"/>
+      <w:r>
+        <w:rPr>
+          <w:rStyle w:val="CommentReference"/>
+        </w:rPr>
+        <w:commentReference w:id="8"/>
+      </w:r>
+      <w:r>
+        <w:t xml:space="preserve">, creating new opportunities for wildlife, people, and domestic animals to interact with one another in proximity. </w:t>
+      </w:r>
+      <w:commentRangeStart w:id="9"/>
+      <w:ins w:id="10" w:author="Kelsey McCune" w:date="2026-03-24T08:12:00Z" w16du:dateUtc="2026-03-24T13:12:00Z">
+        <w:r>
+          <w:t>the human-wildlife interface</w:t>
+        </w:r>
+        <w:commentRangeEnd w:id="9"/>
+        <w:r>
+          <w:rPr>
+            <w:rStyle w:val="CommentReference"/>
+          </w:rPr>
+          <w:commentReference w:id="9"/>
+        </w:r>
+        <w:r>
+          <w:t xml:space="preserve">, </w:t>
+        </w:r>
+      </w:ins>
+      <w:commentRangeStart w:id="11"/>
+      <w:r>
+        <w:t xml:space="preserve">As activities like backyard bird-feeding and small-scale poultry become more popularized, the responsibility of satisfying the lack of knowledge and research becomes greater. </w:t>
+      </w:r>
+      <w:commentRangeEnd w:id="11"/>
+      <w:r>
+        <w:rPr>
+          <w:rStyle w:val="CommentReference"/>
+        </w:rPr>
+        <w:commentReference w:id="11"/>
       </w:r>
     </w:p>
     <w:p>
@@ -177,13 +282,119 @@
       <w:r>
         <w:br/>
       </w:r>
-      <w:r>
-        <w:t xml:space="preserve">"Small-scale" or "backyard" poultry keeping refers to the practice of homeowners maintaining small flocks of chickens on or around their property for purposes such as egg and meat production, animal husbandry, or participation in sustainable food systems. Backyard bird feeding has similarly been a well-established at-home activity for decades, allowing homeowners opportunities to connect with nature and wildlife while supplementing the diets of wild birds. The scale of bird feeding in the United States is substantial, with federal surveys estimating that over 50 million Americans participate in feeding wild birds, and hundreds of millions of dollars spent on bird seed annually (USFWS 2022). </w:t>
-      </w:r>
-    </w:p>
-    <w:p>
-      <w:r>
-        <w:t xml:space="preserve">These backyard activities are often carried out by non-professionals in private setting where there is insufficient disease knowledge and little to no guidelines on management. This often creates opportunities for contact between wild bird species, chicken flocks, domestic pets and humans as well and can allow for bidirectional transmission of select pathogens carried by animals or contracted from the environment. Poultry are known to be reservoirs and may amplify the persistence for some of these bacteria like </w:t>
+      <w:ins w:id="12" w:author="Kelsey McCune" w:date="2026-03-24T08:22:00Z" w16du:dateUtc="2026-03-24T13:22:00Z">
+        <w:r>
+          <w:t xml:space="preserve">Add a topic sentence here about </w:t>
+        </w:r>
+      </w:ins>
+      <w:ins w:id="13" w:author="Kelsey McCune" w:date="2026-03-24T08:23:00Z" w16du:dateUtc="2026-03-24T13:23:00Z">
+        <w:r>
+          <w:t xml:space="preserve">bird feeding and </w:t>
+        </w:r>
+      </w:ins>
+      <w:ins w:id="14" w:author="Kelsey McCune" w:date="2026-03-24T08:22:00Z" w16du:dateUtc="2026-03-24T13:22:00Z">
+        <w:r>
+          <w:t>poultry</w:t>
+        </w:r>
+      </w:ins>
+      <w:ins w:id="15" w:author="Kelsey McCune" w:date="2026-03-24T08:23:00Z" w16du:dateUtc="2026-03-24T13:23:00Z">
+        <w:r>
+          <w:t xml:space="preserve"> as an emerging</w:t>
+        </w:r>
+      </w:ins>
+      <w:ins w:id="16" w:author="Kelsey McCune" w:date="2026-03-24T08:25:00Z" w16du:dateUtc="2026-03-24T13:25:00Z">
+        <w:r>
+          <w:t xml:space="preserve"> hobby expanding the human-wildlife interface.</w:t>
+        </w:r>
+      </w:ins>
+      <w:ins w:id="17" w:author="Kelsey McCune" w:date="2026-03-24T08:23:00Z" w16du:dateUtc="2026-03-24T13:23:00Z">
+        <w:r>
+          <w:t xml:space="preserve"> </w:t>
+        </w:r>
+      </w:ins>
+      <w:r>
+        <w:t xml:space="preserve">"Small-scale" or "backyard" poultry keeping refers to the practice of homeowners maintaining small flocks of chickens on or around their property for purposes such as egg and meat production, animal husbandry, or participation in sustainable food systems. Backyard bird feeding has similarly been a well-established </w:t>
+      </w:r>
+      <w:del w:id="18" w:author="Kelsey McCune" w:date="2026-03-24T08:26:00Z" w16du:dateUtc="2026-03-24T13:26:00Z">
+        <w:r>
+          <w:delText>at-</w:delText>
+        </w:r>
+      </w:del>
+      <w:r>
+        <w:t xml:space="preserve">home activity for decades, allowing homeowners opportunities to connect with nature and wildlife while supplementing the diets of wild birds. The scale of bird feeding in the United States is substantial, with federal surveys estimating that over 50 million Americans participate in feeding wild birds, and hundreds of millions of dollars spent on bird seed annually (USFWS 2022). </w:t>
+      </w:r>
+    </w:p>
+    <w:p>
+      <w:commentRangeStart w:id="19"/>
+      <w:r>
+        <w:t xml:space="preserve">These backyard activities are often carried out </w:t>
+      </w:r>
+      <w:del w:id="20" w:author="Kelsey McCune" w:date="2026-03-24T08:31:00Z" w16du:dateUtc="2026-03-24T13:31:00Z">
+        <w:r>
+          <w:delText xml:space="preserve">by non-professionals </w:delText>
+        </w:r>
+      </w:del>
+      <w:r>
+        <w:t xml:space="preserve">in private setting where there is insufficient disease knowledge and little to no guidelines on </w:t>
+      </w:r>
+      <w:ins w:id="21" w:author="Kelsey McCune" w:date="2026-03-24T08:31:00Z" w16du:dateUtc="2026-03-24T13:31:00Z">
+        <w:r>
+          <w:t>safety o</w:t>
+        </w:r>
+      </w:ins>
+      <w:ins w:id="22" w:author="Kelsey McCune" w:date="2026-03-24T08:32:00Z" w16du:dateUtc="2026-03-24T13:32:00Z">
+        <w:r>
+          <w:t xml:space="preserve">r risk </w:t>
+        </w:r>
+      </w:ins>
+      <w:r>
+        <w:t>management</w:t>
+      </w:r>
+      <w:commentRangeEnd w:id="19"/>
+      <w:r>
+        <w:rPr>
+          <w:rStyle w:val="CommentReference"/>
+        </w:rPr>
+        <w:commentReference w:id="19"/>
+      </w:r>
+      <w:r>
+        <w:t>. This often creates opportunities for</w:t>
+      </w:r>
+      <w:ins w:id="23" w:author="Kelsey McCune" w:date="2026-03-24T08:27:00Z" w16du:dateUtc="2026-03-24T13:27:00Z">
+        <w:r>
+          <w:t xml:space="preserve"> novel</w:t>
+        </w:r>
+      </w:ins>
+      <w:r>
+        <w:t xml:space="preserve"> contact between wild bird species, chicken flocks, domestic pets and humans as well and can allow </w:t>
+      </w:r>
+      <w:commentRangeStart w:id="24"/>
+      <w:r>
+        <w:t>for bidirectional transmission of select pathogens</w:t>
+      </w:r>
+      <w:commentRangeEnd w:id="24"/>
+      <w:r>
+        <w:rPr>
+          <w:rStyle w:val="CommentReference"/>
+        </w:rPr>
+        <w:commentReference w:id="24"/>
+      </w:r>
+      <w:r>
+        <w:t xml:space="preserve"> carried by animals or contracted from the environment. </w:t>
+      </w:r>
+      <w:commentRangeStart w:id="25"/>
+      <w:r>
+        <w:t>Poultry are known to be reservoirs</w:t>
+      </w:r>
+      <w:commentRangeEnd w:id="25"/>
+      <w:r>
+        <w:rPr>
+          <w:rStyle w:val="CommentReference"/>
+        </w:rPr>
+        <w:commentReference w:id="25"/>
+      </w:r>
+      <w:r>
+        <w:t xml:space="preserve"> and may amplify the persistence for some of these bacteria like </w:t>
       </w:r>
       <w:r>
         <w:rPr>
@@ -202,8 +413,13 @@
         </w:rPr>
         <w:t>Escherichia coli</w:t>
       </w:r>
-      <w:r>
-        <w:t xml:space="preserve"> as well. Combined proximity </w:t>
+      <w:del w:id="26" w:author="Kelsey McCune" w:date="2026-03-24T08:27:00Z" w16du:dateUtc="2026-03-24T13:27:00Z">
+        <w:r>
+          <w:delText xml:space="preserve"> as well</w:delText>
+        </w:r>
+      </w:del>
+      <w:r>
+        <w:t xml:space="preserve">. Combined proximity </w:t>
       </w:r>
       <w:r>
         <w:t>of</w:t>
@@ -233,6 +449,7 @@
       </w:r>
     </w:p>
     <w:p>
+      <w:commentRangeStart w:id="27"/>
       <w:r>
         <w:rPr>
           <w:b/>
@@ -243,14 +460,31 @@
       </w:r>
       <w:r>
         <w:br/>
+      </w:r>
+      <w:commentRangeEnd w:id="27"/>
+      <w:r>
+        <w:rPr>
+          <w:rStyle w:val="CommentReference"/>
+        </w:rPr>
+        <w:commentReference w:id="27"/>
+      </w:r>
+      <w:r>
         <w:t xml:space="preserve">As backyard bird feeding and small-scale poultry practices become more widespread in the US, the lack of public risk perception and management recommendations creates the risk for potential pathogen transmission that remains unknown for wild bird, domestic animal and human health alike. </w:t>
       </w:r>
+      <w:commentRangeStart w:id="28"/>
       <w:r>
         <w:t xml:space="preserve">While commercial or industrial poultry procedures implement rigid biosecurity guidelines to prevent disease outbreak and spillover events, residential or private settings lack outreach, guidelines, and oversight, making activities like backyard bird-feeding and small-scale poultry a potential risk for participants, wildlife and pets. </w:t>
       </w:r>
       <w:r>
         <w:t xml:space="preserve">Bird feeders aggregate certain bird species, as well as individuals (cite). Increased contact rates among birds allows for higher pathogen movement and transmission that can potentially result in infection and/or a spillover event (cite). </w:t>
       </w:r>
+      <w:commentRangeEnd w:id="28"/>
+      <w:r>
+        <w:rPr>
+          <w:rStyle w:val="CommentReference"/>
+        </w:rPr>
+        <w:commentReference w:id="28"/>
+      </w:r>
       <w:r>
         <w:t>The lack of information and guidelines for homeowners</w:t>
       </w:r>
@@ -258,7 +492,21 @@
         <w:t xml:space="preserve"> who participate in bird-feeding</w:t>
       </w:r>
       <w:r>
-        <w:t xml:space="preserve"> in central Alabama shows a gap in public safety, as these activities are growing with urbanization. </w:t>
+        <w:t xml:space="preserve"> </w:t>
+      </w:r>
+      <w:commentRangeStart w:id="29"/>
+      <w:r>
+        <w:t xml:space="preserve">in central Alabama </w:t>
+      </w:r>
+      <w:commentRangeEnd w:id="29"/>
+      <w:r>
+        <w:rPr>
+          <w:rStyle w:val="CommentReference"/>
+        </w:rPr>
+        <w:commentReference w:id="29"/>
+      </w:r>
+      <w:r>
+        <w:t xml:space="preserve">shows a gap in public safety, as these activities are growing with urbanization. </w:t>
       </w:r>
     </w:p>
     <w:p>
@@ -267,6 +515,7 @@
       </w:r>
     </w:p>
     <w:p>
+      <w:commentRangeStart w:id="30"/>
       <w:r>
         <w:rPr>
           <w:b/>
@@ -275,17 +524,52 @@
         <w:lastRenderedPageBreak/>
         <w:t>P4:</w:t>
       </w:r>
+      <w:commentRangeEnd w:id="30"/>
+      <w:r>
+        <w:rPr>
+          <w:rStyle w:val="CommentReference"/>
+        </w:rPr>
+        <w:commentReference w:id="30"/>
+      </w:r>
       <w:r>
         <w:br/>
       </w:r>
-      <w:r>
-        <w:t xml:space="preserve">Aside from disease concerns, it is also worth </w:t>
-      </w:r>
-      <w:r>
-        <w:t>stating</w:t>
-      </w:r>
-      <w:r>
-        <w:t xml:space="preserve"> that bird feeding and backyard poultry keeping have real benefits for the people who </w:t>
+      <w:del w:id="31" w:author="Kelsey McCune" w:date="2026-03-24T08:54:00Z" w16du:dateUtc="2026-03-24T13:54:00Z">
+        <w:r>
+          <w:delText xml:space="preserve">Aside from disease concerns, it is also worth </w:delText>
+        </w:r>
+        <w:r>
+          <w:delText>stating</w:delText>
+        </w:r>
+        <w:r>
+          <w:delText xml:space="preserve"> that</w:delText>
+        </w:r>
+      </w:del>
+      <w:ins w:id="32" w:author="Kelsey McCune" w:date="2026-03-24T08:54:00Z" w16du:dateUtc="2026-03-24T13:54:00Z">
+        <w:r>
+          <w:t>However, the risk of disease spillover through</w:t>
+        </w:r>
+      </w:ins>
+      <w:r>
+        <w:t xml:space="preserve"> bird feeding and backyard poultry keeping </w:t>
+      </w:r>
+      <w:del w:id="33" w:author="Kelsey McCune" w:date="2026-03-24T08:54:00Z" w16du:dateUtc="2026-03-24T13:54:00Z">
+        <w:r>
+          <w:delText xml:space="preserve">have </w:delText>
+        </w:r>
+      </w:del>
+      <w:ins w:id="34" w:author="Kelsey McCune" w:date="2026-03-24T08:54:00Z" w16du:dateUtc="2026-03-24T13:54:00Z">
+        <w:r>
+          <w:t xml:space="preserve">is potentially balanced by the </w:t>
+        </w:r>
+      </w:ins>
+      <w:del w:id="35" w:author="Kelsey McCune" w:date="2026-03-24T08:54:00Z" w16du:dateUtc="2026-03-24T13:54:00Z">
+        <w:r>
+          <w:delText xml:space="preserve">real </w:delText>
+        </w:r>
+      </w:del>
+      <w:r>
+        <w:t xml:space="preserve">benefits for the people who </w:t>
       </w:r>
       <w:r>
         <w:t>participate</w:t>
@@ -305,8 +589,18 @@
       <w:r>
         <w:t>mental health</w:t>
       </w:r>
-      <w:r>
-        <w:t>. Effects</w:t>
+      <w:ins w:id="36" w:author="Kelsey McCune" w:date="2026-03-24T08:51:00Z" w16du:dateUtc="2026-03-24T13:51:00Z">
+        <w:r>
+          <w:t xml:space="preserve"> through e</w:t>
+        </w:r>
+      </w:ins>
+      <w:del w:id="37" w:author="Kelsey McCune" w:date="2026-03-24T08:51:00Z" w16du:dateUtc="2026-03-24T13:51:00Z">
+        <w:r>
+          <w:delText>. E</w:delText>
+        </w:r>
+      </w:del>
+      <w:r>
+        <w:t>ffects</w:t>
       </w:r>
       <w:r>
         <w:t xml:space="preserve"> like reduced stress and anxiety, improved mood, cognitive restoration, and feelings of connection to the natural world (cite).</w:t>
@@ -315,11 +609,37 @@
         <w:t xml:space="preserve"> </w:t>
       </w:r>
       <w:r>
-        <w:t xml:space="preserve">For many participants, maintaining a bird feeder </w:t>
-      </w:r>
-      <w:r>
-        <w:t>provides a</w:t>
-      </w:r>
+        <w:t xml:space="preserve">For many </w:t>
+      </w:r>
+      <w:del w:id="38" w:author="Kelsey McCune" w:date="2026-03-24T08:51:00Z" w16du:dateUtc="2026-03-24T13:51:00Z">
+        <w:r>
+          <w:delText>participants</w:delText>
+        </w:r>
+      </w:del>
+      <w:ins w:id="39" w:author="Kelsey McCune" w:date="2026-03-24T08:51:00Z" w16du:dateUtc="2026-03-24T13:51:00Z">
+        <w:r>
+          <w:t>p</w:t>
+        </w:r>
+        <w:r>
+          <w:t>eople</w:t>
+        </w:r>
+      </w:ins>
+      <w:r>
+        <w:t xml:space="preserve">, maintaining a bird feeder </w:t>
+      </w:r>
+      <w:r>
+        <w:t xml:space="preserve">provides </w:t>
+      </w:r>
+      <w:ins w:id="40" w:author="Kelsey McCune" w:date="2026-03-24T08:51:00Z" w16du:dateUtc="2026-03-24T13:51:00Z">
+        <w:r>
+          <w:t>the only</w:t>
+        </w:r>
+      </w:ins>
+      <w:del w:id="41" w:author="Kelsey McCune" w:date="2026-03-24T08:52:00Z" w16du:dateUtc="2026-03-24T13:52:00Z">
+        <w:r>
+          <w:delText>a</w:delText>
+        </w:r>
+      </w:del>
       <w:r>
         <w:t xml:space="preserve"> daily form of accessible, low-cost </w:t>
       </w:r>
@@ -327,7 +647,15 @@
         <w:t>interaction</w:t>
       </w:r>
       <w:r>
-        <w:t xml:space="preserve"> with wildlife that can be integrated into residential life. Studies have found that even brief</w:t>
+        <w:t xml:space="preserve"> with wildlife</w:t>
+      </w:r>
+      <w:del w:id="42" w:author="Kelsey McCune" w:date="2026-03-24T08:52:00Z" w16du:dateUtc="2026-03-24T13:52:00Z">
+        <w:r>
+          <w:delText xml:space="preserve"> that can be integrated into residential life</w:delText>
+        </w:r>
+      </w:del>
+      <w:r>
+        <w:t>. Studies have found that even brief</w:t>
       </w:r>
       <w:r>
         <w:t xml:space="preserve"> </w:t>
@@ -345,7 +673,20 @@
         <w:t>relief</w:t>
       </w:r>
       <w:r>
-        <w:t xml:space="preserve"> and stress recovery (cite). Small-scale poultry keeping is similarly associated with feelings of self-sufficiency, fulfillment, and stewardship, particularly among urban and suburban residents seeking engagement with food systems and animal care (cite). Households with children may additionally benefit from the educational value of these activities in </w:t>
+        <w:t xml:space="preserve"> and stress recovery (cite). Small-scale poultry keeping is similarly associated with feelings of self-sufficiency, fulfillment, and stewardship, particularly among urban and suburban residents seeking engagement with food systems and animal care (cite). Households with children may additionally benefit from the educational value of these activities </w:t>
+      </w:r>
+      <w:ins w:id="43" w:author="Kelsey McCune" w:date="2026-03-24T08:55:00Z" w16du:dateUtc="2026-03-24T13:55:00Z">
+        <w:r>
+          <w:t>by</w:t>
+        </w:r>
+      </w:ins>
+      <w:del w:id="44" w:author="Kelsey McCune" w:date="2026-03-24T08:55:00Z" w16du:dateUtc="2026-03-24T13:55:00Z">
+        <w:r>
+          <w:delText>in</w:delText>
+        </w:r>
+      </w:del>
+      <w:r>
+        <w:t xml:space="preserve"> </w:t>
       </w:r>
       <w:r>
         <w:t>incorporating an</w:t>
@@ -377,6 +718,11 @@
     </w:p>
     <w:p/>
     <w:p>
+      <w:pPr>
+        <w:rPr>
+          <w:ins w:id="45" w:author="Kelsey McCune" w:date="2026-03-24T08:56:00Z" w16du:dateUtc="2026-03-24T13:56:00Z"/>
+        </w:rPr>
+      </w:pPr>
       <w:r>
         <w:rPr>
           <w:b/>
@@ -391,8 +737,17 @@
         </w:rPr>
         <w:br/>
       </w:r>
-      <w:r>
-        <w:t>Despite the benefits associate with t</w:t>
+      <w:commentRangeStart w:id="46"/>
+      <w:r>
+        <w:t>Despite the benefits associate</w:t>
+      </w:r>
+      <w:ins w:id="47" w:author="Kelsey McCune" w:date="2026-03-24T08:55:00Z" w16du:dateUtc="2026-03-24T13:55:00Z">
+        <w:r>
+          <w:t>d</w:t>
+        </w:r>
+      </w:ins>
+      <w:r>
+        <w:t xml:space="preserve"> with t</w:t>
       </w:r>
       <w:r>
         <w:t>hese activities</w:t>
@@ -443,7 +798,30 @@
         <w:t>persistence</w:t>
       </w:r>
       <w:r>
-        <w:t xml:space="preserve"> in wild songbirds remain poorly understood. Most existing research addresses these practices in isolation, and few studies have examined disease ecology at residential sites where both feeders and chickens are </w:t>
+        <w:t xml:space="preserve"> in wild songbirds remain poorly understood. </w:t>
+      </w:r>
+      <w:commentRangeEnd w:id="46"/>
+      <w:r>
+        <w:rPr>
+          <w:rStyle w:val="CommentReference"/>
+        </w:rPr>
+        <w:commentReference w:id="46"/>
+      </w:r>
+    </w:p>
+    <w:p>
+      <w:commentRangeStart w:id="48"/>
+      <w:r>
+        <w:t xml:space="preserve">Most existing research </w:t>
+      </w:r>
+      <w:commentRangeEnd w:id="48"/>
+      <w:r>
+        <w:rPr>
+          <w:rStyle w:val="CommentReference"/>
+        </w:rPr>
+        <w:commentReference w:id="48"/>
+      </w:r>
+      <w:r>
+        <w:t xml:space="preserve">addresses these practices in isolation, and few studies have examined disease ecology at residential sites where both feeders and chickens are </w:t>
       </w:r>
       <w:r>
         <w:t>both</w:t>
@@ -513,7 +891,18 @@
         <w:t>critical</w:t>
       </w:r>
       <w:r>
-        <w:t xml:space="preserve"> for developing evidence-based guidelines that allow people to enjoy the benefits of backyard activities while reducing risk to wild birds, domestic animals, and human health.</w:t>
+        <w:t xml:space="preserve"> for developing evidence-based guidelines that allow people to enjoy the benefits of backyard activities while reducing risk to wild birds, domestic animals, and </w:t>
+      </w:r>
+      <w:commentRangeStart w:id="49"/>
+      <w:r>
+        <w:t>human health.</w:t>
+      </w:r>
+      <w:commentRangeEnd w:id="49"/>
+      <w:r>
+        <w:rPr>
+          <w:rStyle w:val="CommentReference"/>
+        </w:rPr>
+        <w:commentReference w:id="49"/>
       </w:r>
     </w:p>
     <w:p>
@@ -614,10 +1003,7 @@
         <w:t>We seek</w:t>
       </w:r>
       <w:r>
-        <w:t xml:space="preserve"> to test the relationship between individual feeder visitation frequency and pathogen infection status in PIT-tagged wild birds using RFID technology. We predict that wild birds with higher feeder visitation frequencies will have a higher probability of testing positive for </w:t>
-      </w:r>
-      <w:r>
-        <w:t>pathogen infection</w:t>
+        <w:t xml:space="preserve"> to test the relationship between individual feeder visitation frequency and pathogen infection status in PIT-tagged wild birds using RFID technology. We predict that wild birds with higher feeder visitation frequencies will have a higher probability of testing positive for pathogen infection</w:t>
       </w:r>
       <w:r>
         <w:t>.</w:t>
@@ -631,13 +1017,7 @@
       </w:r>
       <w:proofErr w:type="gramEnd"/>
       <w:r>
-        <w:t xml:space="preserve"> aggregate individuals and increase fecal-oral contact rates, then birds that visit feeders more frequently will </w:t>
-      </w:r>
-      <w:r>
-        <w:t>sustain</w:t>
-      </w:r>
-      <w:r>
-        <w:t xml:space="preserve"> greater exposure to environmental pathogen</w:t>
+        <w:t xml:space="preserve"> aggregate individuals and increase fecal-oral contact rates, then birds that visit feeders more frequently will sustain greater exposure to environmental pathogen</w:t>
       </w:r>
       <w:r>
         <w:t xml:space="preserve">s </w:t>
@@ -717,22 +1097,13 @@
         <w:t>We</w:t>
       </w:r>
       <w:r>
-        <w:t xml:space="preserve"> will characterize disease risk perception, biosecurity practice engagement, willingness to </w:t>
-      </w:r>
-      <w:r>
-        <w:t>adjust</w:t>
-      </w:r>
-      <w:r>
-        <w:t xml:space="preserve"> backyard behaviors, and place attachment among participants in bird feeding and backyard poultry keeping in central Alabama through participant surveys. We predict that participants with greater perceived risk of disease </w:t>
+        <w:t xml:space="preserve"> will characterize disease risk perception, biosecurity practice engagement, willingness to adjust backyard behaviors, and place attachment among participants in bird feeding and backyard poultry keeping in central Alabama through participant surveys. We predict that participants with greater perceived risk of disease </w:t>
       </w:r>
       <w:r>
         <w:t>events</w:t>
       </w:r>
       <w:r>
-        <w:t xml:space="preserve"> will report higher rates of biosecurity </w:t>
-      </w:r>
-      <w:r>
-        <w:t>practice</w:t>
+        <w:t xml:space="preserve"> will report higher rates of biosecurity practice</w:t>
       </w:r>
       <w:r>
         <w:t>s,</w:t>
@@ -782,6 +1153,315 @@
     </w:sectPr>
   </w:body>
 </w:document>
+</file>
+
+<file path=word/comments.xml><?xml version="1.0" encoding="utf-8"?>
+<w:comments xmlns:wpc="http://schemas.microsoft.com/office/word/2010/wordprocessingCanvas" xmlns:cx="http://schemas.microsoft.com/office/drawing/2014/chartex" xmlns:cx1="http://schemas.microsoft.com/office/drawing/2015/9/8/chartex" xmlns:cx2="http://schemas.microsoft.com/office/drawing/2015/10/21/chartex" xmlns:cx3="http://schemas.microsoft.com/office/drawing/2016/5/9/chartex" xmlns:cx4="http://schemas.microsoft.com/office/drawing/2016/5/10/chartex" xmlns:cx5="http://schemas.microsoft.com/office/drawing/2016/5/11/chartex" xmlns:cx6="http://schemas.microsoft.com/office/drawing/2016/5/12/chartex" xmlns:cx7="http://schemas.microsoft.com/office/drawing/2016/5/13/chartex" xmlns:cx8="http://schemas.microsoft.com/office/drawing/2016/5/14/chartex" xmlns:mc="http://schemas.openxmlformats.org/markup-compatibility/2006" xmlns:aink="http://schemas.microsoft.com/office/drawing/2016/ink" xmlns:am3d="http://schemas.microsoft.com/office/drawing/2017/model3d" xmlns:o="urn:schemas-microsoft-com:office:office" xmlns:oel="http://schemas.microsoft.com/office/2019/extlst" xmlns:r="http://schemas.openxmlformats.org/officeDocument/2006/relationships" xmlns:m="http://schemas.openxmlformats.org/officeDocument/2006/math" xmlns:v="urn:schemas-microsoft-com:vml" xmlns:wp14="http://schemas.microsoft.com/office/word/2010/wordprocessingDrawing" xmlns:wp="http://schemas.openxmlformats.org/drawingml/2006/wordprocessingDrawing" xmlns:w10="urn:schemas-microsoft-com:office:word" xmlns:w="http://schemas.openxmlformats.org/wordprocessingml/2006/main" xmlns:w14="http://schemas.microsoft.com/office/word/2010/wordml" xmlns:w15="http://schemas.microsoft.com/office/word/2012/wordml" xmlns:w16cex="http://schemas.microsoft.com/office/word/2018/wordml/cex" xmlns:w16cid="http://schemas.microsoft.com/office/word/2016/wordml/cid" xmlns:w16="http://schemas.microsoft.com/office/word/2018/wordml" xmlns:w16du="http://schemas.microsoft.com/office/word/2023/wordml/word16du" xmlns:w16sdtdh="http://schemas.microsoft.com/office/word/2020/wordml/sdtdatahash" xmlns:w16sdtfl="http://schemas.microsoft.com/office/word/2024/wordml/sdtformatlock" xmlns:w16se="http://schemas.microsoft.com/office/word/2015/wordml/symex" xmlns:wpg="http://schemas.microsoft.com/office/word/2010/wordprocessingGroup" xmlns:wpi="http://schemas.microsoft.com/office/word/2010/wordprocessingInk" xmlns:wne="http://schemas.microsoft.com/office/word/2006/wordml" xmlns:wps="http://schemas.microsoft.com/office/word/2010/wordprocessingShape" mc:Ignorable="w14 w15 w16se w16cid w16 w16cex w16sdtdh w16sdtfl w16du wp14">
+  <w:comment w:id="6" w:author="Kelsey McCune" w:date="2026-03-24T08:11:00Z" w:initials="KBM">
+    <w:p>
+      <w:r>
+        <w:rPr>
+          <w:rStyle w:val="CommentReference"/>
+        </w:rPr>
+        <w:annotationRef/>
+      </w:r>
+      <w:r>
+        <w:rPr>
+          <w:sz w:val="20"/>
+          <w:szCs w:val="20"/>
+        </w:rPr>
+        <w:t>I think the human-wildlife interface needs a little more background because your average scientitist won't know what this means.</w:t>
+      </w:r>
+    </w:p>
+  </w:comment>
+  <w:comment w:id="8" w:author="Kelsey McCune" w:date="2026-03-24T08:13:00Z" w:initials="KBM">
+    <w:p>
+      <w:r>
+        <w:rPr>
+          <w:rStyle w:val="CommentReference"/>
+        </w:rPr>
+        <w:annotationRef/>
+      </w:r>
+      <w:r>
+        <w:rPr>
+          <w:sz w:val="20"/>
+          <w:szCs w:val="20"/>
+        </w:rPr>
+        <w:t>Paragraph 1 is too early to narrow your focus to the Southeast US. This probably shouldn't be introduced until near the end of the intro.</w:t>
+      </w:r>
+    </w:p>
+  </w:comment>
+  <w:comment w:id="9" w:author="Kelsey McCune" w:date="2026-03-24T08:11:00Z" w:initials="KBM">
+    <w:p>
+      <w:r>
+        <w:rPr>
+          <w:rStyle w:val="CommentReference"/>
+        </w:rPr>
+        <w:annotationRef/>
+      </w:r>
+      <w:r>
+        <w:rPr>
+          <w:sz w:val="20"/>
+          <w:szCs w:val="20"/>
+        </w:rPr>
+        <w:t>I think the human-wildlife interface needs a little more background because your average scientist won't know what this means. It would make sense to define it after this sentence about anthropogenic change.</w:t>
+      </w:r>
+    </w:p>
+  </w:comment>
+  <w:comment w:id="11" w:author="Kelsey McCune" w:date="2026-03-24T08:22:00Z" w:initials="KBM">
+    <w:p>
+      <w:r>
+        <w:rPr>
+          <w:rStyle w:val="CommentReference"/>
+        </w:rPr>
+        <w:annotationRef/>
+      </w:r>
+      <w:r>
+        <w:rPr>
+          <w:sz w:val="20"/>
+          <w:szCs w:val="20"/>
+        </w:rPr>
+        <w:t>Currently, it feels a bit sudden to jump into bird feeding/poultry keeping. Your next paragraph is about these things, so you don't need to talk about them much here. For this last sentence, it would be better to remember your topic sentence and close this paragraph out with something about how it is important for birds and humans to further our understanding of how anthropogenic change is altering the way we interact.</w:t>
+      </w:r>
+    </w:p>
+  </w:comment>
+  <w:comment w:id="19" w:author="Kelsey McCune" w:date="2026-03-24T08:24:00Z" w:initials="KBM">
+    <w:p>
+      <w:r>
+        <w:rPr>
+          <w:rStyle w:val="CommentReference"/>
+        </w:rPr>
+        <w:annotationRef/>
+      </w:r>
+      <w:r>
+        <w:rPr>
+          <w:sz w:val="20"/>
+          <w:szCs w:val="20"/>
+        </w:rPr>
+        <w:t>The reader does not yet know anything about these activities and changes in disease risk. I think this sentence would fit better paired with the last sentence and moved to the beginning of the next paragraph.</w:t>
+      </w:r>
+    </w:p>
+  </w:comment>
+  <w:comment w:id="24" w:author="Kelsey McCune" w:date="2026-03-24T08:29:00Z" w:initials="KBM">
+    <w:p>
+      <w:r>
+        <w:rPr>
+          <w:rStyle w:val="CommentReference"/>
+        </w:rPr>
+        <w:annotationRef/>
+      </w:r>
+      <w:r>
+        <w:rPr>
+          <w:sz w:val="20"/>
+          <w:szCs w:val="20"/>
+        </w:rPr>
+        <w:t>I think we will want to expand on why novel contact at the human-wildlife interface is bad/dangerous for both people and birds, including some examples from the literature.</w:t>
+      </w:r>
+    </w:p>
+  </w:comment>
+  <w:comment w:id="25" w:author="Kelsey McCune" w:date="2026-03-24T08:31:00Z" w:initials="KBM">
+    <w:p>
+      <w:r>
+        <w:rPr>
+          <w:rStyle w:val="CommentReference"/>
+        </w:rPr>
+        <w:annotationRef/>
+      </w:r>
+      <w:r>
+        <w:rPr>
+          <w:sz w:val="20"/>
+          <w:szCs w:val="20"/>
+        </w:rPr>
+        <w:t>Here also, I think it would be good to add an example from the literature of a novel disease that poultry transmitted to birds at this human-wildlife interface.</w:t>
+      </w:r>
+    </w:p>
+  </w:comment>
+  <w:comment w:id="27" w:author="Kelsey McCune" w:date="2026-03-24T08:34:00Z" w:initials="KBM">
+    <w:p>
+      <w:r>
+        <w:rPr>
+          <w:rStyle w:val="CommentReference"/>
+        </w:rPr>
+        <w:annotationRef/>
+      </w:r>
+      <w:r>
+        <w:rPr>
+          <w:sz w:val="20"/>
+          <w:szCs w:val="20"/>
+        </w:rPr>
+        <w:t xml:space="preserve">This paragraph has some good sentences on why there is a disease risk at feeders/with poultry that I think should go in the paragraph above. Instead, it may make sense to have this paragraph be about biosecurity and people's knowledge of disease risk (which will set up your survey chapter). </w:t>
+      </w:r>
+    </w:p>
+    <w:p>
+      <w:r>
+        <w:rPr>
+          <w:sz w:val="20"/>
+          <w:szCs w:val="20"/>
+        </w:rPr>
+        <w:t>It would be good to include some examples here from the literature on occasions when there were outbreaks directly tied to poultry/feeders or backyard wildlife. Is there any literature on what people know about disease risk from poultry/feeders or papers on how biosecurity practices reduce this risk?</w:t>
+      </w:r>
+    </w:p>
+  </w:comment>
+  <w:comment w:id="28" w:author="Kelsey McCune" w:date="2026-03-24T08:36:00Z" w:initials="KBM">
+    <w:p>
+      <w:r>
+        <w:rPr>
+          <w:rStyle w:val="CommentReference"/>
+        </w:rPr>
+        <w:annotationRef/>
+      </w:r>
+      <w:r>
+        <w:rPr>
+          <w:sz w:val="20"/>
+          <w:szCs w:val="20"/>
+        </w:rPr>
+        <w:t>Move this content to the preceding paragraph.</w:t>
+      </w:r>
+    </w:p>
+  </w:comment>
+  <w:comment w:id="29" w:author="Kelsey McCune" w:date="2026-03-24T08:36:00Z" w:initials="KBM">
+    <w:p>
+      <w:r>
+        <w:rPr>
+          <w:rStyle w:val="CommentReference"/>
+        </w:rPr>
+        <w:annotationRef/>
+      </w:r>
+      <w:r>
+        <w:rPr>
+          <w:sz w:val="20"/>
+          <w:szCs w:val="20"/>
+        </w:rPr>
+        <w:t>Still too soon to narrow your research scope down to your study site.</w:t>
+      </w:r>
+    </w:p>
+  </w:comment>
+  <w:comment w:id="30" w:author="Kelsey McCune" w:date="2026-03-24T08:53:00Z" w:initials="KBM">
+    <w:p>
+      <w:r>
+        <w:rPr>
+          <w:rStyle w:val="CommentReference"/>
+        </w:rPr>
+        <w:annotationRef/>
+      </w:r>
+      <w:r>
+        <w:rPr>
+          <w:sz w:val="20"/>
+          <w:szCs w:val="20"/>
+        </w:rPr>
+        <w:t>Great job in this paragraph supporting your statements with examples from the literature.</w:t>
+      </w:r>
+    </w:p>
+  </w:comment>
+  <w:comment w:id="46" w:author="Kelsey McCune" w:date="2026-03-24T08:57:00Z" w:initials="KBM">
+    <w:p>
+      <w:r>
+        <w:rPr>
+          <w:rStyle w:val="CommentReference"/>
+        </w:rPr>
+        <w:annotationRef/>
+      </w:r>
+      <w:r>
+        <w:rPr>
+          <w:sz w:val="20"/>
+          <w:szCs w:val="20"/>
+        </w:rPr>
+        <w:t xml:space="preserve">These statements are better fit the themes of previous paragraphs.  </w:t>
+      </w:r>
+    </w:p>
+  </w:comment>
+  <w:comment w:id="48" w:author="Kelsey McCune" w:date="2026-03-24T09:01:00Z" w:initials="KBM">
+    <w:p>
+      <w:r>
+        <w:rPr>
+          <w:rStyle w:val="CommentReference"/>
+        </w:rPr>
+        <w:annotationRef/>
+      </w:r>
+      <w:r>
+        <w:rPr>
+          <w:sz w:val="20"/>
+          <w:szCs w:val="20"/>
+        </w:rPr>
+        <w:t xml:space="preserve">Yes, this is the general content that is needed for the last paragraph. We will tweak this paragraph more as we refine the rest of the intro, but one thing to think about is why is the southeastern US the right place to fill this gap in knowledge? </w:t>
+      </w:r>
+    </w:p>
+  </w:comment>
+  <w:comment w:id="49" w:author="Kelsey McCune" w:date="2026-03-24T09:02:00Z" w:initials="KBM">
+    <w:p>
+      <w:r>
+        <w:rPr>
+          <w:rStyle w:val="CommentReference"/>
+        </w:rPr>
+        <w:annotationRef/>
+      </w:r>
+      <w:r>
+        <w:rPr>
+          <w:sz w:val="20"/>
+          <w:szCs w:val="20"/>
+        </w:rPr>
+        <w:t xml:space="preserve">Now at the end of the intro consider whether you have given enough information to set up all aspects of your research? </w:t>
+      </w:r>
+    </w:p>
+  </w:comment>
+</w:comments>
+</file>
+
+<file path=word/commentsExtended.xml><?xml version="1.0" encoding="utf-8"?>
+<w15:commentsEx xmlns:wpc="http://schemas.microsoft.com/office/word/2010/wordprocessingCanvas" xmlns:cx="http://schemas.microsoft.com/office/drawing/2014/chartex" xmlns:cx1="http://schemas.microsoft.com/office/drawing/2015/9/8/chartex" xmlns:cx2="http://schemas.microsoft.com/office/drawing/2015/10/21/chartex" xmlns:cx3="http://schemas.microsoft.com/office/drawing/2016/5/9/chartex" xmlns:cx4="http://schemas.microsoft.com/office/drawing/2016/5/10/chartex" xmlns:cx5="http://schemas.microsoft.com/office/drawing/2016/5/11/chartex" xmlns:cx6="http://schemas.microsoft.com/office/drawing/2016/5/12/chartex" xmlns:cx7="http://schemas.microsoft.com/office/drawing/2016/5/13/chartex" xmlns:cx8="http://schemas.microsoft.com/office/drawing/2016/5/14/chartex" xmlns:mc="http://schemas.openxmlformats.org/markup-compatibility/2006" xmlns:aink="http://schemas.microsoft.com/office/drawing/2016/ink" xmlns:am3d="http://schemas.microsoft.com/office/drawing/2017/model3d" xmlns:o="urn:schemas-microsoft-com:office:office" xmlns:oel="http://schemas.microsoft.com/office/2019/extlst" xmlns:r="http://schemas.openxmlformats.org/officeDocument/2006/relationships" xmlns:m="http://schemas.openxmlformats.org/officeDocument/2006/math" xmlns:v="urn:schemas-microsoft-com:vml" xmlns:wp14="http://schemas.microsoft.com/office/word/2010/wordprocessingDrawing" xmlns:wp="http://schemas.openxmlformats.org/drawingml/2006/wordprocessingDrawing" xmlns:w10="urn:schemas-microsoft-com:office:word" xmlns:w="http://schemas.openxmlformats.org/wordprocessingml/2006/main" xmlns:w14="http://schemas.microsoft.com/office/word/2010/wordml" xmlns:w15="http://schemas.microsoft.com/office/word/2012/wordml" xmlns:w16cex="http://schemas.microsoft.com/office/word/2018/wordml/cex" xmlns:w16cid="http://schemas.microsoft.com/office/word/2016/wordml/cid" xmlns:w16="http://schemas.microsoft.com/office/word/2018/wordml" xmlns:w16du="http://schemas.microsoft.com/office/word/2023/wordml/word16du" xmlns:w16sdtdh="http://schemas.microsoft.com/office/word/2020/wordml/sdtdatahash" xmlns:w16sdtfl="http://schemas.microsoft.com/office/word/2024/wordml/sdtformatlock" xmlns:w16se="http://schemas.microsoft.com/office/word/2015/wordml/symex" xmlns:wpg="http://schemas.microsoft.com/office/word/2010/wordprocessingGroup" xmlns:wpi="http://schemas.microsoft.com/office/word/2010/wordprocessingInk" xmlns:wne="http://schemas.microsoft.com/office/word/2006/wordml" xmlns:wps="http://schemas.microsoft.com/office/word/2010/wordprocessingShape" mc:Ignorable="w14 w15 w16se w16cid w16 w16cex w16sdtdh w16sdtfl w16du wp14">
+  <w15:commentEx w15:paraId="5FA8B827" w15:done="0"/>
+  <w15:commentEx w15:paraId="5B22123C" w15:done="0"/>
+  <w15:commentEx w15:paraId="7E64BDFB" w15:done="0"/>
+  <w15:commentEx w15:paraId="51338341" w15:done="0"/>
+  <w15:commentEx w15:paraId="4DE48B6F" w15:done="0"/>
+  <w15:commentEx w15:paraId="064D17F0" w15:done="0"/>
+  <w15:commentEx w15:paraId="7717EC76" w15:done="0"/>
+  <w15:commentEx w15:paraId="7711DA1C" w15:done="0"/>
+  <w15:commentEx w15:paraId="60E1EAFE" w15:done="0"/>
+  <w15:commentEx w15:paraId="5ED837D7" w15:done="0"/>
+  <w15:commentEx w15:paraId="29677283" w15:done="0"/>
+  <w15:commentEx w15:paraId="7C37E974" w15:done="0"/>
+  <w15:commentEx w15:paraId="77C467A3" w15:done="0"/>
+  <w15:commentEx w15:paraId="585E9004" w15:done="0"/>
+</w15:commentsEx>
+</file>
+
+<file path=word/commentsExtensible.xml><?xml version="1.0" encoding="utf-8"?>
+<w16cex:commentsExtensible xmlns:wpc="http://schemas.microsoft.com/office/word/2010/wordprocessingCanvas" xmlns:cx="http://schemas.microsoft.com/office/drawing/2014/chartex" xmlns:cx1="http://schemas.microsoft.com/office/drawing/2015/9/8/chartex" xmlns:cx2="http://schemas.microsoft.com/office/drawing/2015/10/21/chartex" xmlns:cx3="http://schemas.microsoft.com/office/drawing/2016/5/9/chartex" xmlns:cx4="http://schemas.microsoft.com/office/drawing/2016/5/10/chartex" xmlns:cx5="http://schemas.microsoft.com/office/drawing/2016/5/11/chartex" xmlns:cx6="http://schemas.microsoft.com/office/drawing/2016/5/12/chartex" xmlns:cx7="http://schemas.microsoft.com/office/drawing/2016/5/13/chartex" xmlns:cx8="http://schemas.microsoft.com/office/drawing/2016/5/14/chartex" xmlns:cr="http://schemas.microsoft.com/office/comments/2020/reactions" xmlns:mc="http://schemas.openxmlformats.org/markup-compatibility/2006" xmlns:aink="http://schemas.microsoft.com/office/drawing/2016/ink" xmlns:am3d="http://schemas.microsoft.com/office/drawing/2017/model3d" xmlns:o="urn:schemas-microsoft-com:office:office" xmlns:oel="http://schemas.microsoft.com/office/2019/extlst" xmlns:r="http://schemas.openxmlformats.org/officeDocument/2006/relationships" xmlns:m="http://schemas.openxmlformats.org/officeDocument/2006/math" xmlns:v="urn:schemas-microsoft-com:vml" xmlns:wp14="http://schemas.microsoft.com/office/word/2010/wordprocessingDrawing" xmlns:wp="http://schemas.openxmlformats.org/drawingml/2006/wordprocessingDrawing" xmlns:w10="urn:schemas-microsoft-com:office:word" xmlns:w="http://schemas.openxmlformats.org/wordprocessingml/2006/main" xmlns:w14="http://schemas.microsoft.com/office/word/2010/wordml" xmlns:w15="http://schemas.microsoft.com/office/word/2012/wordml" xmlns:w16cex="http://schemas.microsoft.com/office/word/2018/wordml/cex" xmlns:w16cid="http://schemas.microsoft.com/office/word/2016/wordml/cid" xmlns:w16="http://schemas.microsoft.com/office/word/2018/wordml" xmlns:w16du="http://schemas.microsoft.com/office/word/2023/wordml/word16du" xmlns:w16sdtdh="http://schemas.microsoft.com/office/word/2020/wordml/sdtdatahash" xmlns:w16sdtfl="http://schemas.microsoft.com/office/word/2024/wordml/sdtformatlock" xmlns:w16se="http://schemas.microsoft.com/office/word/2015/wordml/symex" xmlns:wpg="http://schemas.microsoft.com/office/word/2010/wordprocessingGroup" xmlns:wpi="http://schemas.microsoft.com/office/word/2010/wordprocessingInk" xmlns:wne="http://schemas.microsoft.com/office/word/2006/wordml" xmlns:wps="http://schemas.microsoft.com/office/word/2010/wordprocessingShape" mc:Ignorable="w14 w15 w16se w16cid w16 w16cex w16sdtdh w16sdtfl cr w16du wp14">
+  <w16cex:commentExtensible w16cex:durableId="10DFC577" w16cex:dateUtc="2026-03-24T13:11:00Z"/>
+  <w16cex:commentExtensible w16cex:durableId="371E78F4" w16cex:dateUtc="2026-03-24T13:13:00Z"/>
+  <w16cex:commentExtensible w16cex:durableId="5C155437" w16cex:dateUtc="2026-03-24T13:11:00Z"/>
+  <w16cex:commentExtensible w16cex:durableId="603F8FA8" w16cex:dateUtc="2026-03-24T13:22:00Z"/>
+  <w16cex:commentExtensible w16cex:durableId="29663838" w16cex:dateUtc="2026-03-24T13:24:00Z"/>
+  <w16cex:commentExtensible w16cex:durableId="706CEB93" w16cex:dateUtc="2026-03-24T13:29:00Z"/>
+  <w16cex:commentExtensible w16cex:durableId="4C91FD2E" w16cex:dateUtc="2026-03-24T13:31:00Z"/>
+  <w16cex:commentExtensible w16cex:durableId="36F00E77" w16cex:dateUtc="2026-03-24T13:34:00Z"/>
+  <w16cex:commentExtensible w16cex:durableId="4C713301" w16cex:dateUtc="2026-03-24T13:36:00Z"/>
+  <w16cex:commentExtensible w16cex:durableId="156AA4C8" w16cex:dateUtc="2026-03-24T13:36:00Z"/>
+  <w16cex:commentExtensible w16cex:durableId="423EDE45" w16cex:dateUtc="2026-03-24T13:53:00Z"/>
+  <w16cex:commentExtensible w16cex:durableId="650090B1" w16cex:dateUtc="2026-03-24T13:57:00Z"/>
+  <w16cex:commentExtensible w16cex:durableId="5441F447" w16cex:dateUtc="2026-03-24T14:01:00Z"/>
+  <w16cex:commentExtensible w16cex:durableId="6D1D4A8C" w16cex:dateUtc="2026-03-24T14:02:00Z"/>
+</w16cex:commentsExtensible>
+</file>
+
+<file path=word/commentsIds.xml><?xml version="1.0" encoding="utf-8"?>
+<w16cid:commentsIds xmlns:wpc="http://schemas.microsoft.com/office/word/2010/wordprocessingCanvas" xmlns:cx="http://schemas.microsoft.com/office/drawing/2014/chartex" xmlns:cx1="http://schemas.microsoft.com/office/drawing/2015/9/8/chartex" xmlns:cx2="http://schemas.microsoft.com/office/drawing/2015/10/21/chartex" xmlns:cx3="http://schemas.microsoft.com/office/drawing/2016/5/9/chartex" xmlns:cx4="http://schemas.microsoft.com/office/drawing/2016/5/10/chartex" xmlns:cx5="http://schemas.microsoft.com/office/drawing/2016/5/11/chartex" xmlns:cx6="http://schemas.microsoft.com/office/drawing/2016/5/12/chartex" xmlns:cx7="http://schemas.microsoft.com/office/drawing/2016/5/13/chartex" xmlns:cx8="http://schemas.microsoft.com/office/drawing/2016/5/14/chartex" xmlns:mc="http://schemas.openxmlformats.org/markup-compatibility/2006" xmlns:aink="http://schemas.microsoft.com/office/drawing/2016/ink" xmlns:am3d="http://schemas.microsoft.com/office/drawing/2017/model3d" xmlns:o="urn:schemas-microsoft-com:office:office" xmlns:oel="http://schemas.microsoft.com/office/2019/extlst" xmlns:r="http://schemas.openxmlformats.org/officeDocument/2006/relationships" xmlns:m="http://schemas.openxmlformats.org/officeDocument/2006/math" xmlns:v="urn:schemas-microsoft-com:vml" xmlns:wp14="http://schemas.microsoft.com/office/word/2010/wordprocessingDrawing" xmlns:wp="http://schemas.openxmlformats.org/drawingml/2006/wordprocessingDrawing" xmlns:w10="urn:schemas-microsoft-com:office:word" xmlns:w="http://schemas.openxmlformats.org/wordprocessingml/2006/main" xmlns:w14="http://schemas.microsoft.com/office/word/2010/wordml" xmlns:w15="http://schemas.microsoft.com/office/word/2012/wordml" xmlns:w16cex="http://schemas.microsoft.com/office/word/2018/wordml/cex" xmlns:w16cid="http://schemas.microsoft.com/office/word/2016/wordml/cid" xmlns:w16="http://schemas.microsoft.com/office/word/2018/wordml" xmlns:w16du="http://schemas.microsoft.com/office/word/2023/wordml/word16du" xmlns:w16sdtdh="http://schemas.microsoft.com/office/word/2020/wordml/sdtdatahash" xmlns:w16sdtfl="http://schemas.microsoft.com/office/word/2024/wordml/sdtformatlock" xmlns:w16se="http://schemas.microsoft.com/office/word/2015/wordml/symex" xmlns:wpg="http://schemas.microsoft.com/office/word/2010/wordprocessingGroup" xmlns:wpi="http://schemas.microsoft.com/office/word/2010/wordprocessingInk" xmlns:wne="http://schemas.microsoft.com/office/word/2006/wordml" xmlns:wps="http://schemas.microsoft.com/office/word/2010/wordprocessingShape" mc:Ignorable="w14 w15 w16se w16cid w16 w16cex w16sdtdh w16sdtfl w16du wp14">
+  <w16cid:commentId w16cid:paraId="5FA8B827" w16cid:durableId="10DFC577"/>
+  <w16cid:commentId w16cid:paraId="5B22123C" w16cid:durableId="371E78F4"/>
+  <w16cid:commentId w16cid:paraId="7E64BDFB" w16cid:durableId="5C155437"/>
+  <w16cid:commentId w16cid:paraId="51338341" w16cid:durableId="603F8FA8"/>
+  <w16cid:commentId w16cid:paraId="4DE48B6F" w16cid:durableId="29663838"/>
+  <w16cid:commentId w16cid:paraId="064D17F0" w16cid:durableId="706CEB93"/>
+  <w16cid:commentId w16cid:paraId="7717EC76" w16cid:durableId="4C91FD2E"/>
+  <w16cid:commentId w16cid:paraId="7711DA1C" w16cid:durableId="36F00E77"/>
+  <w16cid:commentId w16cid:paraId="60E1EAFE" w16cid:durableId="4C713301"/>
+  <w16cid:commentId w16cid:paraId="5ED837D7" w16cid:durableId="156AA4C8"/>
+  <w16cid:commentId w16cid:paraId="29677283" w16cid:durableId="423EDE45"/>
+  <w16cid:commentId w16cid:paraId="7C37E974" w16cid:durableId="650090B1"/>
+  <w16cid:commentId w16cid:paraId="77C467A3" w16cid:durableId="5441F447"/>
+  <w16cid:commentId w16cid:paraId="585E9004" w16cid:durableId="6D1D4A8C"/>
+</w16cid:commentsIds>
 </file>
 
 <file path=word/endnotes.xml><?xml version="1.0" encoding="utf-8"?>
@@ -929,6 +1609,14 @@
     <w:abstractNumId w:val="0"/>
   </w:num>
 </w:numbering>
+</file>
+
+<file path=word/people.xml><?xml version="1.0" encoding="utf-8"?>
+<w15:people xmlns:wpc="http://schemas.microsoft.com/office/word/2010/wordprocessingCanvas" xmlns:cx="http://schemas.microsoft.com/office/drawing/2014/chartex" xmlns:cx1="http://schemas.microsoft.com/office/drawing/2015/9/8/chartex" xmlns:cx2="http://schemas.microsoft.com/office/drawing/2015/10/21/chartex" xmlns:cx3="http://schemas.microsoft.com/office/drawing/2016/5/9/chartex" xmlns:cx4="http://schemas.microsoft.com/office/drawing/2016/5/10/chartex" xmlns:cx5="http://schemas.microsoft.com/office/drawing/2016/5/11/chartex" xmlns:cx6="http://schemas.microsoft.com/office/drawing/2016/5/12/chartex" xmlns:cx7="http://schemas.microsoft.com/office/drawing/2016/5/13/chartex" xmlns:cx8="http://schemas.microsoft.com/office/drawing/2016/5/14/chartex" xmlns:mc="http://schemas.openxmlformats.org/markup-compatibility/2006" xmlns:aink="http://schemas.microsoft.com/office/drawing/2016/ink" xmlns:am3d="http://schemas.microsoft.com/office/drawing/2017/model3d" xmlns:o="urn:schemas-microsoft-com:office:office" xmlns:oel="http://schemas.microsoft.com/office/2019/extlst" xmlns:r="http://schemas.openxmlformats.org/officeDocument/2006/relationships" xmlns:m="http://schemas.openxmlformats.org/officeDocument/2006/math" xmlns:v="urn:schemas-microsoft-com:vml" xmlns:wp14="http://schemas.microsoft.com/office/word/2010/wordprocessingDrawing" xmlns:wp="http://schemas.openxmlformats.org/drawingml/2006/wordprocessingDrawing" xmlns:w10="urn:schemas-microsoft-com:office:word" xmlns:w="http://schemas.openxmlformats.org/wordprocessingml/2006/main" xmlns:w14="http://schemas.microsoft.com/office/word/2010/wordml" xmlns:w15="http://schemas.microsoft.com/office/word/2012/wordml" xmlns:w16cex="http://schemas.microsoft.com/office/word/2018/wordml/cex" xmlns:w16cid="http://schemas.microsoft.com/office/word/2016/wordml/cid" xmlns:w16="http://schemas.microsoft.com/office/word/2018/wordml" xmlns:w16du="http://schemas.microsoft.com/office/word/2023/wordml/word16du" xmlns:w16sdtdh="http://schemas.microsoft.com/office/word/2020/wordml/sdtdatahash" xmlns:w16sdtfl="http://schemas.microsoft.com/office/word/2024/wordml/sdtformatlock" xmlns:w16se="http://schemas.microsoft.com/office/word/2015/wordml/symex" xmlns:wpg="http://schemas.microsoft.com/office/word/2010/wordprocessingGroup" xmlns:wpi="http://schemas.microsoft.com/office/word/2010/wordprocessingInk" xmlns:wne="http://schemas.microsoft.com/office/word/2006/wordml" xmlns:wps="http://schemas.microsoft.com/office/word/2010/wordprocessingShape" mc:Ignorable="w14 w15 w16se w16cid w16 w16cex w16sdtdh w16sdtfl w16du wp14">
+  <w15:person w15:author="Kelsey McCune">
+    <w15:presenceInfo w15:providerId="None" w15:userId="Kelsey McCune"/>
+  </w15:person>
+</w15:people>
 </file>
 
 <file path=word/styles.xml><?xml version="1.0" encoding="utf-8"?>
@@ -1534,6 +2222,7 @@
   <w:style w:type="character" w:default="1" w:styleId="DefaultParagraphFont">
     <w:name w:val="Default Paragraph Font"/>
     <w:uiPriority w:val="1"/>
+    <w:semiHidden/>
     <w:unhideWhenUsed/>
   </w:style>
   <w:style w:type="table" w:default="1" w:styleId="TableNormal">
@@ -1890,6 +2579,84 @@
     <w:link w:val="Footer"/>
     <w:uiPriority w:val="99"/>
     <w:rsid w:val="00E30DE2"/>
+  </w:style>
+  <w:style w:type="paragraph" w:styleId="Revision">
+    <w:name w:val="Revision"/>
+    <w:hidden/>
+    <w:uiPriority w:val="99"/>
+    <w:semiHidden/>
+    <w:rsid w:val="00462E21"/>
+    <w:pPr>
+      <w:spacing w:after="0" w:line="240" w:lineRule="auto"/>
+    </w:pPr>
+  </w:style>
+  <w:style w:type="character" w:styleId="CommentReference">
+    <w:name w:val="annotation reference"/>
+    <w:basedOn w:val="DefaultParagraphFont"/>
+    <w:uiPriority w:val="99"/>
+    <w:semiHidden/>
+    <w:unhideWhenUsed/>
+    <w:rsid w:val="00462E21"/>
+    <w:rPr>
+      <w:sz w:val="16"/>
+      <w:szCs w:val="16"/>
+    </w:rPr>
+  </w:style>
+  <w:style w:type="paragraph" w:styleId="CommentText">
+    <w:name w:val="annotation text"/>
+    <w:basedOn w:val="Normal"/>
+    <w:link w:val="CommentTextChar"/>
+    <w:uiPriority w:val="99"/>
+    <w:semiHidden/>
+    <w:unhideWhenUsed/>
+    <w:rsid w:val="00462E21"/>
+    <w:pPr>
+      <w:spacing w:line="240" w:lineRule="auto"/>
+    </w:pPr>
+    <w:rPr>
+      <w:sz w:val="20"/>
+      <w:szCs w:val="20"/>
+    </w:rPr>
+  </w:style>
+  <w:style w:type="character" w:customStyle="1" w:styleId="CommentTextChar">
+    <w:name w:val="Comment Text Char"/>
+    <w:basedOn w:val="DefaultParagraphFont"/>
+    <w:link w:val="CommentText"/>
+    <w:uiPriority w:val="99"/>
+    <w:semiHidden/>
+    <w:rsid w:val="00462E21"/>
+    <w:rPr>
+      <w:sz w:val="20"/>
+      <w:szCs w:val="20"/>
+    </w:rPr>
+  </w:style>
+  <w:style w:type="paragraph" w:styleId="CommentSubject">
+    <w:name w:val="annotation subject"/>
+    <w:basedOn w:val="CommentText"/>
+    <w:next w:val="CommentText"/>
+    <w:link w:val="CommentSubjectChar"/>
+    <w:uiPriority w:val="99"/>
+    <w:semiHidden/>
+    <w:unhideWhenUsed/>
+    <w:rsid w:val="00462E21"/>
+    <w:rPr>
+      <w:b/>
+      <w:bCs/>
+    </w:rPr>
+  </w:style>
+  <w:style w:type="character" w:customStyle="1" w:styleId="CommentSubjectChar">
+    <w:name w:val="Comment Subject Char"/>
+    <w:basedOn w:val="CommentTextChar"/>
+    <w:link w:val="CommentSubject"/>
+    <w:uiPriority w:val="99"/>
+    <w:semiHidden/>
+    <w:rsid w:val="00462E21"/>
+    <w:rPr>
+      <w:b/>
+      <w:bCs/>
+      <w:sz w:val="20"/>
+      <w:szCs w:val="20"/>
+    </w:rPr>
   </w:style>
 </w:styles>
 </file>

</xml_diff>

<commit_message>
Comments and edits to Objectives/Aims section
</commit_message>
<xml_diff>
--- a/Documents /MS Thesis Intro..docx
+++ b/Documents /MS Thesis Intro..docx
@@ -935,6 +935,7 @@
       </w:r>
     </w:p>
     <w:p>
+      <w:commentRangeStart w:id="50"/>
       <w:r>
         <w:t xml:space="preserve">The overarching goal of this study is to </w:t>
       </w:r>
@@ -980,7 +981,17 @@
         <w:t>biosecurity</w:t>
       </w:r>
       <w:r>
-        <w:t xml:space="preserve"> risks. This study addresses three specific aims:</w:t>
+        <w:t xml:space="preserve"> risks. </w:t>
+      </w:r>
+      <w:commentRangeEnd w:id="50"/>
+      <w:r>
+        <w:rPr>
+          <w:rStyle w:val="CommentReference"/>
+        </w:rPr>
+        <w:commentReference w:id="50"/>
+      </w:r>
+      <w:r>
+        <w:t>This study addresses three specific aims:</w:t>
       </w:r>
     </w:p>
     <w:p>
@@ -995,101 +1006,445 @@
           <w:b/>
           <w:bCs/>
         </w:rPr>
-        <w:t>Aim 1: Feeder Visitation Frequency and Pathogen Infection Status</w:t>
-      </w:r>
-    </w:p>
-    <w:p>
-      <w:r>
-        <w:t>We seek</w:t>
-      </w:r>
-      <w:r>
-        <w:t xml:space="preserve"> to test the relationship between individual feeder visitation frequency and pathogen infection status in PIT-tagged wild birds using RFID technology. We predict that wild birds with higher feeder visitation frequencies will have a higher probability of testing positive for pathogen infection</w:t>
-      </w:r>
-      <w:r>
-        <w:t>.</w:t>
-      </w:r>
-      <w:r>
-        <w:t xml:space="preserve"> If bird </w:t>
-      </w:r>
-      <w:proofErr w:type="gramStart"/>
-      <w:r>
-        <w:t>feeders</w:t>
-      </w:r>
-      <w:proofErr w:type="gramEnd"/>
-      <w:r>
-        <w:t xml:space="preserve"> aggregate individuals and increase fecal-oral contact rates, then birds that visit feeders more frequently will sustain greater exposure to environmental pathogen</w:t>
-      </w:r>
-      <w:r>
-        <w:t xml:space="preserve">s </w:t>
-      </w:r>
-      <w:r>
-        <w:t xml:space="preserve">deposited by other individuals, resulting in </w:t>
-      </w:r>
-      <w:r>
-        <w:t>higher</w:t>
-      </w:r>
-      <w:r>
-        <w:t xml:space="preserve"> infection prevalence relative to less frequent feeder visitors.</w:t>
-      </w:r>
-    </w:p>
-    <w:p>
-      <w:pPr>
+        <w:t xml:space="preserve">Aim 1: </w:t>
+      </w:r>
+      <w:ins w:id="51" w:author="Kelsey McCune" w:date="2026-03-24T09:10:00Z" w16du:dateUtc="2026-03-24T14:10:00Z">
+        <w:r>
+          <w:rPr>
+            <w:b/>
+            <w:bCs/>
+          </w:rPr>
+          <w:t>Quantify f</w:t>
+        </w:r>
+      </w:ins>
+      <w:del w:id="52" w:author="Kelsey McCune" w:date="2026-03-24T09:10:00Z" w16du:dateUtc="2026-03-24T14:10:00Z">
+        <w:r>
+          <w:rPr>
+            <w:b/>
+            <w:bCs/>
+          </w:rPr>
+          <w:delText>F</w:delText>
+        </w:r>
+      </w:del>
+      <w:r>
         <w:rPr>
           <w:b/>
           <w:bCs/>
         </w:rPr>
-      </w:pPr>
+        <w:t xml:space="preserve">eeder </w:t>
+      </w:r>
+      <w:ins w:id="53" w:author="Kelsey McCune" w:date="2026-03-24T09:10:00Z" w16du:dateUtc="2026-03-24T14:10:00Z">
+        <w:r>
+          <w:rPr>
+            <w:b/>
+            <w:bCs/>
+          </w:rPr>
+          <w:t>v</w:t>
+        </w:r>
+      </w:ins>
+      <w:del w:id="54" w:author="Kelsey McCune" w:date="2026-03-24T09:10:00Z" w16du:dateUtc="2026-03-24T14:10:00Z">
+        <w:r>
+          <w:rPr>
+            <w:b/>
+            <w:bCs/>
+          </w:rPr>
+          <w:delText>V</w:delText>
+        </w:r>
+      </w:del>
       <w:r>
         <w:rPr>
           <w:b/>
           <w:bCs/>
         </w:rPr>
-        <w:t>Aim 2: Pathogen Prevalence Across Site Treatment Types</w:t>
-      </w:r>
-    </w:p>
-    <w:p>
-      <w:r>
-        <w:t>We seek</w:t>
-      </w:r>
-      <w:r>
-        <w:t xml:space="preserve"> to compare pathogen prevalence in wild songbirds among sites representing four treatment types: bird feeder only, backyard chickens only, both feeders and chickens, and control sites with neither. We predict that sites with both bird feeders and backyard chickens will exhibit the highest pathogen prevalence in wild birds, followed by chicken-only sites, feeder-only sites, and control sites. If the presence of backyard poultry introduces an additional environmental reservoir for </w:t>
-      </w:r>
-      <w:r>
-        <w:rPr>
-          <w:i/>
-          <w:iCs/>
-        </w:rPr>
-        <w:t>S. enterica</w:t>
-      </w:r>
-      <w:r>
-        <w:t xml:space="preserve">, and bird feeders simultaneously increase contact rates among wild birds, then sites with compounded </w:t>
-      </w:r>
-      <w:r>
-        <w:t>factors</w:t>
-      </w:r>
-      <w:r>
-        <w:t xml:space="preserve"> will </w:t>
-      </w:r>
-      <w:r>
-        <w:t>show</w:t>
-      </w:r>
-      <w:r>
-        <w:t xml:space="preserve"> the greatest disease transmission risk.</w:t>
-      </w:r>
-    </w:p>
-    <w:p>
-      <w:pPr>
+        <w:t xml:space="preserve">isitation </w:t>
+      </w:r>
+      <w:ins w:id="55" w:author="Kelsey McCune" w:date="2026-03-24T09:10:00Z" w16du:dateUtc="2026-03-24T14:10:00Z">
+        <w:r>
+          <w:rPr>
+            <w:b/>
+            <w:bCs/>
+          </w:rPr>
+          <w:t>f</w:t>
+        </w:r>
+      </w:ins>
+      <w:del w:id="56" w:author="Kelsey McCune" w:date="2026-03-24T09:10:00Z" w16du:dateUtc="2026-03-24T14:10:00Z">
+        <w:r>
+          <w:rPr>
+            <w:b/>
+            <w:bCs/>
+          </w:rPr>
+          <w:delText>F</w:delText>
+        </w:r>
+      </w:del>
+      <w:r>
         <w:rPr>
           <w:b/>
           <w:bCs/>
         </w:rPr>
-      </w:pPr>
+        <w:t xml:space="preserve">requency and </w:t>
+      </w:r>
+      <w:commentRangeStart w:id="57"/>
+      <w:ins w:id="58" w:author="Kelsey McCune" w:date="2026-03-24T09:10:00Z" w16du:dateUtc="2026-03-24T14:10:00Z">
+        <w:r>
+          <w:rPr>
+            <w:b/>
+            <w:bCs/>
+          </w:rPr>
+          <w:t>p</w:t>
+        </w:r>
+      </w:ins>
+      <w:del w:id="59" w:author="Kelsey McCune" w:date="2026-03-24T09:10:00Z" w16du:dateUtc="2026-03-24T14:10:00Z">
+        <w:r>
+          <w:rPr>
+            <w:b/>
+            <w:bCs/>
+          </w:rPr>
+          <w:delText>P</w:delText>
+        </w:r>
+      </w:del>
       <w:r>
         <w:rPr>
           <w:b/>
           <w:bCs/>
         </w:rPr>
-        <w:t>Aim 3: Human Risk Perception, Biosecurity Practices, and Pro-Conservation Attitudes</w:t>
+        <w:t xml:space="preserve">athogen </w:t>
+      </w:r>
+      <w:ins w:id="60" w:author="Kelsey McCune" w:date="2026-03-24T09:10:00Z" w16du:dateUtc="2026-03-24T14:10:00Z">
+        <w:r>
+          <w:rPr>
+            <w:b/>
+            <w:bCs/>
+          </w:rPr>
+          <w:t>i</w:t>
+        </w:r>
+      </w:ins>
+      <w:del w:id="61" w:author="Kelsey McCune" w:date="2026-03-24T09:10:00Z" w16du:dateUtc="2026-03-24T14:10:00Z">
+        <w:r>
+          <w:rPr>
+            <w:b/>
+            <w:bCs/>
+          </w:rPr>
+          <w:delText>I</w:delText>
+        </w:r>
+      </w:del>
+      <w:r>
+        <w:rPr>
+          <w:b/>
+          <w:bCs/>
+        </w:rPr>
+        <w:t xml:space="preserve">nfection </w:t>
+      </w:r>
+      <w:ins w:id="62" w:author="Kelsey McCune" w:date="2026-03-24T09:10:00Z" w16du:dateUtc="2026-03-24T14:10:00Z">
+        <w:r>
+          <w:rPr>
+            <w:b/>
+            <w:bCs/>
+          </w:rPr>
+          <w:t>s</w:t>
+        </w:r>
+      </w:ins>
+      <w:del w:id="63" w:author="Kelsey McCune" w:date="2026-03-24T09:10:00Z" w16du:dateUtc="2026-03-24T14:10:00Z">
+        <w:r>
+          <w:rPr>
+            <w:b/>
+            <w:bCs/>
+          </w:rPr>
+          <w:delText>S</w:delText>
+        </w:r>
+      </w:del>
+      <w:r>
+        <w:rPr>
+          <w:b/>
+          <w:bCs/>
+        </w:rPr>
+        <w:t>tatus</w:t>
+      </w:r>
+      <w:commentRangeEnd w:id="57"/>
+      <w:r>
+        <w:rPr>
+          <w:rStyle w:val="CommentReference"/>
+        </w:rPr>
+        <w:commentReference w:id="57"/>
+      </w:r>
+    </w:p>
+    <w:p>
+      <w:r>
+        <w:t>We seek</w:t>
+      </w:r>
+      <w:r>
+        <w:t xml:space="preserve"> to test the relationship between </w:t>
+      </w:r>
+      <w:del w:id="64" w:author="Kelsey McCune" w:date="2026-03-24T09:12:00Z" w16du:dateUtc="2026-03-24T14:12:00Z">
+        <w:r>
+          <w:delText>individual feeder visitation</w:delText>
+        </w:r>
+      </w:del>
+      <w:ins w:id="65" w:author="Kelsey McCune" w:date="2026-03-24T09:12:00Z" w16du:dateUtc="2026-03-24T14:12:00Z">
+        <w:r>
+          <w:t>the</w:t>
+        </w:r>
+      </w:ins>
+      <w:r>
+        <w:t xml:space="preserve"> frequency</w:t>
+      </w:r>
+      <w:ins w:id="66" w:author="Kelsey McCune" w:date="2026-03-24T09:12:00Z" w16du:dateUtc="2026-03-24T14:12:00Z">
+        <w:r>
+          <w:t xml:space="preserve"> that birds </w:t>
+        </w:r>
+      </w:ins>
+      <w:ins w:id="67" w:author="Kelsey McCune" w:date="2026-03-24T09:13:00Z" w16du:dateUtc="2026-03-24T14:13:00Z">
+        <w:r>
+          <w:t>visit food sources</w:t>
+        </w:r>
+      </w:ins>
+      <w:r>
+        <w:t xml:space="preserve"> and </w:t>
+      </w:r>
+      <w:del w:id="68" w:author="Kelsey McCune" w:date="2026-03-24T09:14:00Z" w16du:dateUtc="2026-03-24T14:14:00Z">
+        <w:r>
+          <w:delText xml:space="preserve">pathogen </w:delText>
+        </w:r>
+      </w:del>
+      <w:ins w:id="69" w:author="Kelsey McCune" w:date="2026-03-24T09:14:00Z" w16du:dateUtc="2026-03-24T14:14:00Z">
+        <w:r>
+          <w:t>the probability of</w:t>
+        </w:r>
+        <w:r>
+          <w:t xml:space="preserve"> </w:t>
+        </w:r>
+      </w:ins>
+      <w:r>
+        <w:t>infection</w:t>
+      </w:r>
+      <w:ins w:id="70" w:author="Kelsey McCune" w:date="2026-03-24T09:14:00Z" w16du:dateUtc="2026-03-24T14:14:00Z">
+        <w:r>
+          <w:t>.</w:t>
+        </w:r>
+      </w:ins>
+      <w:r>
+        <w:t xml:space="preserve"> </w:t>
+      </w:r>
+      <w:commentRangeStart w:id="71"/>
+      <w:del w:id="72" w:author="Kelsey McCune" w:date="2026-03-24T09:14:00Z" w16du:dateUtc="2026-03-24T14:14:00Z">
+        <w:r>
+          <w:delText xml:space="preserve">status </w:delText>
+        </w:r>
+      </w:del>
+      <w:r>
+        <w:t>in PIT-tagged wild birds using RFID technology.</w:t>
+      </w:r>
+      <w:commentRangeEnd w:id="71"/>
+      <w:r>
+        <w:rPr>
+          <w:rStyle w:val="CommentReference"/>
+        </w:rPr>
+        <w:commentReference w:id="71"/>
+      </w:r>
+      <w:r>
+        <w:t xml:space="preserve"> </w:t>
+      </w:r>
+      <w:moveFromRangeStart w:id="73" w:author="Kelsey McCune" w:date="2026-03-24T09:18:00Z" w:name="move225236346"/>
+      <w:moveFrom w:id="74" w:author="Kelsey McCune" w:date="2026-03-24T09:18:00Z" w16du:dateUtc="2026-03-24T14:18:00Z">
+        <w:r>
+          <w:t>We predict that wild birds with higher feeder visitation frequencies will have a higher probability of testing positive for pathogen infection</w:t>
+        </w:r>
+        <w:r>
+          <w:t>.</w:t>
+        </w:r>
+        <w:r>
+          <w:t xml:space="preserve"> </w:t>
+        </w:r>
+      </w:moveFrom>
+      <w:moveFromRangeEnd w:id="73"/>
+      <w:r>
+        <w:t xml:space="preserve">If bird feeders </w:t>
+      </w:r>
+      <w:ins w:id="75" w:author="Kelsey McCune" w:date="2026-03-24T09:18:00Z" w16du:dateUtc="2026-03-24T14:18:00Z">
+        <w:r>
+          <w:t xml:space="preserve">artificially </w:t>
+        </w:r>
+      </w:ins>
+      <w:r>
+        <w:t xml:space="preserve">aggregate individuals and increase </w:t>
+      </w:r>
+      <w:commentRangeStart w:id="76"/>
+      <w:r>
+        <w:t xml:space="preserve">fecal-oral </w:t>
+      </w:r>
+      <w:commentRangeEnd w:id="76"/>
+      <w:r>
+        <w:rPr>
+          <w:rStyle w:val="CommentReference"/>
+        </w:rPr>
+        <w:commentReference w:id="76"/>
+      </w:r>
+      <w:r>
+        <w:t>contact rates, then birds that visit feeders more frequently will sustain greater exposure to environmental pathogen</w:t>
+      </w:r>
+      <w:r>
+        <w:t xml:space="preserve">s </w:t>
+      </w:r>
+      <w:r>
+        <w:t xml:space="preserve">deposited by other individuals, resulting in </w:t>
+      </w:r>
+      <w:r>
+        <w:t>higher</w:t>
+      </w:r>
+      <w:r>
+        <w:t xml:space="preserve"> infection prevalence relative to less frequent feeder visitors.</w:t>
+      </w:r>
+      <w:ins w:id="77" w:author="Kelsey McCune" w:date="2026-03-24T09:18:00Z" w16du:dateUtc="2026-03-24T14:18:00Z">
+        <w:r>
+          <w:t xml:space="preserve"> Therefore, </w:t>
+        </w:r>
+        <w:commentRangeStart w:id="78"/>
+        <w:r>
+          <w:t>w</w:t>
+        </w:r>
+      </w:ins>
+      <w:moveToRangeStart w:id="79" w:author="Kelsey McCune" w:date="2026-03-24T09:18:00Z" w:name="move225236346"/>
+      <w:moveTo w:id="80" w:author="Kelsey McCune" w:date="2026-03-24T09:18:00Z" w16du:dateUtc="2026-03-24T14:18:00Z">
+        <w:del w:id="81" w:author="Kelsey McCune" w:date="2026-03-24T09:18:00Z" w16du:dateUtc="2026-03-24T14:18:00Z">
+          <w:r>
+            <w:delText>W</w:delText>
+          </w:r>
+        </w:del>
+        <w:r>
+          <w:t xml:space="preserve">e </w:t>
+        </w:r>
+        <w:proofErr w:type="gramStart"/>
+        <w:r>
+          <w:t>predict</w:t>
+        </w:r>
+        <w:proofErr w:type="gramEnd"/>
+        <w:r>
+          <w:t xml:space="preserve"> that </w:t>
+        </w:r>
+      </w:moveTo>
+      <w:commentRangeEnd w:id="78"/>
+      <w:r>
+        <w:rPr>
+          <w:rStyle w:val="CommentReference"/>
+        </w:rPr>
+        <w:commentReference w:id="78"/>
+      </w:r>
+      <w:moveTo w:id="82" w:author="Kelsey McCune" w:date="2026-03-24T09:18:00Z" w16du:dateUtc="2026-03-24T14:18:00Z">
+        <w:r>
+          <w:t>wild birds with higher feeder visitation frequencies will have a higher probability of testing positive for pathogen infection</w:t>
+        </w:r>
+        <w:r>
+          <w:t>.</w:t>
+        </w:r>
+      </w:moveTo>
+      <w:moveToRangeEnd w:id="79"/>
+    </w:p>
+    <w:p>
+      <w:pPr>
+        <w:rPr>
+          <w:b/>
+          <w:bCs/>
+        </w:rPr>
+      </w:pPr>
+      <w:r>
+        <w:rPr>
+          <w:b/>
+          <w:bCs/>
+        </w:rPr>
+        <w:t xml:space="preserve">Aim 2: </w:t>
+      </w:r>
+      <w:commentRangeStart w:id="83"/>
+      <w:r>
+        <w:rPr>
+          <w:b/>
+          <w:bCs/>
+        </w:rPr>
+        <w:t>Pathogen Prevalence Across Site Treatment Types</w:t>
+      </w:r>
+      <w:commentRangeEnd w:id="83"/>
+      <w:r>
+        <w:rPr>
+          <w:rStyle w:val="CommentReference"/>
+        </w:rPr>
+        <w:commentReference w:id="83"/>
+      </w:r>
+    </w:p>
+    <w:p>
+      <w:r>
+        <w:t>We seek</w:t>
+      </w:r>
+      <w:r>
+        <w:t xml:space="preserve"> to compare pathogen prevalence in wild songbirds among sites representing four treatment types: bird feeder only, backyard chickens only, both feeders and chickens, and control sites with neither. We predict that sites with both bird feeders and backyard chickens will exhibit the highest pathogen prevalence in wild birds, followed by chicken-only sites, feeder-only sites, and control sites. If the presence of backyard poultry introduces an additional environmental reservoir for </w:t>
+      </w:r>
+      <w:del w:id="84" w:author="Kelsey McCune" w:date="2026-03-24T09:21:00Z" w16du:dateUtc="2026-03-24T14:21:00Z">
+        <w:r>
+          <w:rPr>
+            <w:rPrChange w:id="85" w:author="Kelsey McCune" w:date="2026-03-24T09:21:00Z" w16du:dateUtc="2026-03-24T14:21:00Z">
+              <w:rPr>
+                <w:i/>
+                <w:iCs/>
+              </w:rPr>
+            </w:rPrChange>
+          </w:rPr>
+          <w:delText>S. enterica</w:delText>
+        </w:r>
+      </w:del>
+      <w:ins w:id="86" w:author="Kelsey McCune" w:date="2026-03-24T09:21:00Z" w16du:dateUtc="2026-03-24T14:21:00Z">
+        <w:r>
+          <w:rPr>
+            <w:rPrChange w:id="87" w:author="Kelsey McCune" w:date="2026-03-24T09:21:00Z" w16du:dateUtc="2026-03-24T14:21:00Z">
+              <w:rPr>
+                <w:i/>
+                <w:iCs/>
+              </w:rPr>
+            </w:rPrChange>
+          </w:rPr>
+          <w:t>pathogens</w:t>
+        </w:r>
+      </w:ins>
+      <w:r>
+        <w:t xml:space="preserve">, and bird feeders simultaneously increase contact rates among wild birds, then sites with compounded </w:t>
+      </w:r>
+      <w:r>
+        <w:t>factors</w:t>
+      </w:r>
+      <w:r>
+        <w:t xml:space="preserve"> will </w:t>
+      </w:r>
+      <w:r>
+        <w:t>show</w:t>
+      </w:r>
+      <w:r>
+        <w:t xml:space="preserve"> the greatest disease transmission risk.</w:t>
+      </w:r>
+    </w:p>
+    <w:p>
+      <w:pPr>
+        <w:rPr>
+          <w:b/>
+          <w:bCs/>
+        </w:rPr>
+      </w:pPr>
+      <w:commentRangeStart w:id="88"/>
+      <w:r>
+        <w:rPr>
+          <w:b/>
+          <w:bCs/>
+        </w:rPr>
+        <w:t xml:space="preserve">Aim 3: </w:t>
+      </w:r>
+      <w:commentRangeEnd w:id="88"/>
+      <w:r>
+        <w:rPr>
+          <w:rStyle w:val="CommentReference"/>
+        </w:rPr>
+        <w:commentReference w:id="88"/>
+      </w:r>
+      <w:r>
+        <w:rPr>
+          <w:b/>
+          <w:bCs/>
+        </w:rPr>
+        <w:t>Human Risk Perception, Biosecurity Practices, and Pro-Conservation Attitudes</w:t>
       </w:r>
     </w:p>
     <w:p>
@@ -1139,7 +1494,18 @@
         <w:t>based on</w:t>
       </w:r>
       <w:r>
-        <w:t xml:space="preserve"> the results of this study will inform practical, relevant biosecurity recommendations for bird feeding and poultry-keeping households</w:t>
+        <w:t xml:space="preserve"> the results of this study will inform practical, relevant biosecurity recommendations for bird feeding and poultry-keeping </w:t>
+      </w:r>
+      <w:commentRangeStart w:id="89"/>
+      <w:r>
+        <w:t>households</w:t>
+      </w:r>
+      <w:commentRangeEnd w:id="89"/>
+      <w:r>
+        <w:rPr>
+          <w:rStyle w:val="CommentReference"/>
+        </w:rPr>
+        <w:commentReference w:id="89"/>
       </w:r>
       <w:r>
         <w:t xml:space="preserve">. </w:t>
@@ -1401,6 +1767,151 @@
           <w:szCs w:val="20"/>
         </w:rPr>
         <w:t xml:space="preserve">Now at the end of the intro consider whether you have given enough information to set up all aspects of your research? </w:t>
+      </w:r>
+    </w:p>
+  </w:comment>
+  <w:comment w:id="50" w:author="Kelsey McCune" w:date="2026-03-24T09:09:00Z" w:initials="KBM">
+    <w:p>
+      <w:r>
+        <w:rPr>
+          <w:rStyle w:val="CommentReference"/>
+        </w:rPr>
+        <w:annotationRef/>
+      </w:r>
+      <w:r>
+        <w:rPr>
+          <w:sz w:val="20"/>
+          <w:szCs w:val="20"/>
+        </w:rPr>
+        <w:t>We will want to make this more broad than sort of restating each aim. Think about the first few paragraphs of your intro to help put this in a broader context.</w:t>
+      </w:r>
+    </w:p>
+  </w:comment>
+  <w:comment w:id="57" w:author="Kelsey McCune" w:date="2026-03-24T09:11:00Z" w:initials="KBM">
+    <w:p>
+      <w:r>
+        <w:rPr>
+          <w:rStyle w:val="CommentReference"/>
+        </w:rPr>
+        <w:annotationRef/>
+      </w:r>
+      <w:r>
+        <w:rPr>
+          <w:sz w:val="20"/>
+          <w:szCs w:val="20"/>
+        </w:rPr>
+        <w:t>Maybe instead say "pathogen prevalence" - When I first read this I thought it meant the infection status of the pathogen, not the bird.</w:t>
+      </w:r>
+    </w:p>
+  </w:comment>
+  <w:comment w:id="71" w:author="Kelsey McCune" w:date="2026-03-24T09:15:00Z" w:initials="KBM">
+    <w:p>
+      <w:r>
+        <w:rPr>
+          <w:rStyle w:val="CommentReference"/>
+        </w:rPr>
+        <w:annotationRef/>
+      </w:r>
+      <w:r>
+        <w:rPr>
+          <w:sz w:val="20"/>
+          <w:szCs w:val="20"/>
+        </w:rPr>
+        <w:t>This is methods that are perhaps too detailed for the Aims section.</w:t>
+      </w:r>
+    </w:p>
+  </w:comment>
+  <w:comment w:id="76" w:author="Kelsey McCune" w:date="2026-03-24T09:17:00Z" w:initials="KBM">
+    <w:p>
+      <w:r>
+        <w:rPr>
+          <w:rStyle w:val="CommentReference"/>
+        </w:rPr>
+        <w:annotationRef/>
+      </w:r>
+      <w:r>
+        <w:rPr>
+          <w:sz w:val="20"/>
+          <w:szCs w:val="20"/>
+        </w:rPr>
+        <w:t>But also increased direct transmission, right?</w:t>
+      </w:r>
+    </w:p>
+    <w:p>
+      <w:r>
+        <w:rPr>
+          <w:sz w:val="20"/>
+          <w:szCs w:val="20"/>
+        </w:rPr>
+        <w:t>I think background on increase of fecal-oral and directly transmitted pathogens should be added to the intro.</w:t>
+      </w:r>
+    </w:p>
+  </w:comment>
+  <w:comment w:id="78" w:author="Kelsey McCune" w:date="2026-03-24T09:20:00Z" w:initials="KBM">
+    <w:p>
+      <w:r>
+        <w:rPr>
+          <w:rStyle w:val="CommentReference"/>
+        </w:rPr>
+        <w:annotationRef/>
+      </w:r>
+      <w:r>
+        <w:rPr>
+          <w:sz w:val="20"/>
+          <w:szCs w:val="20"/>
+        </w:rPr>
+        <w:t>If/then hypothesis statement first, predictions next.</w:t>
+      </w:r>
+    </w:p>
+  </w:comment>
+  <w:comment w:id="83" w:author="Kelsey McCune" w:date="2026-03-24T09:19:00Z" w:initials="KBM">
+    <w:p>
+      <w:r>
+        <w:rPr>
+          <w:rStyle w:val="CommentReference"/>
+        </w:rPr>
+        <w:annotationRef/>
+      </w:r>
+      <w:r>
+        <w:rPr>
+          <w:sz w:val="20"/>
+          <w:szCs w:val="20"/>
+        </w:rPr>
+        <w:t>This is what you will measure, but it is not the goal of this aim, right?</w:t>
+      </w:r>
+    </w:p>
+  </w:comment>
+  <w:comment w:id="88" w:author="Kelsey McCune" w:date="2026-03-24T09:22:00Z" w:initials="KBM">
+    <w:p>
+      <w:r>
+        <w:rPr>
+          <w:rStyle w:val="CommentReference"/>
+        </w:rPr>
+        <w:annotationRef/>
+      </w:r>
+      <w:r>
+        <w:rPr>
+          <w:sz w:val="20"/>
+          <w:szCs w:val="20"/>
+        </w:rPr>
+        <w:t>Again here, this is what you are measuring to address the goal of this specific aim.</w:t>
+      </w:r>
+    </w:p>
+  </w:comment>
+  <w:comment w:id="89" w:author="Kelsey McCune" w:date="2026-03-24T09:25:00Z" w:initials="KBM">
+    <w:p>
+      <w:r>
+        <w:rPr>
+          <w:rStyle w:val="CommentReference"/>
+        </w:rPr>
+        <w:annotationRef/>
+      </w:r>
+      <w:r>
+        <w:rPr>
+          <w:sz w:val="20"/>
+          <w:szCs w:val="20"/>
+        </w:rPr>
+        <w:t>And what about pro-conservation attitudes? You'll want to include something about that in the Aim. Background on this piece was missing from the introduction, and filling that in will help you figure out what to add here for pro-conservation attitudes.</w:t>
       </w:r>
     </w:p>
   </w:comment>
@@ -1423,6 +1934,14 @@
   <w15:commentEx w15:paraId="7C37E974" w15:done="0"/>
   <w15:commentEx w15:paraId="77C467A3" w15:done="0"/>
   <w15:commentEx w15:paraId="585E9004" w15:done="0"/>
+  <w15:commentEx w15:paraId="5D1158DD" w15:done="0"/>
+  <w15:commentEx w15:paraId="7624117C" w15:done="0"/>
+  <w15:commentEx w15:paraId="402D0F2C" w15:done="0"/>
+  <w15:commentEx w15:paraId="5DBB9EB2" w15:done="0"/>
+  <w15:commentEx w15:paraId="59C469B7" w15:done="0"/>
+  <w15:commentEx w15:paraId="068C2E61" w15:done="0"/>
+  <w15:commentEx w15:paraId="65049884" w15:done="0"/>
+  <w15:commentEx w15:paraId="52B940F2" w15:done="0"/>
 </w15:commentsEx>
 </file>
 
@@ -1442,6 +1961,14 @@
   <w16cex:commentExtensible w16cex:durableId="650090B1" w16cex:dateUtc="2026-03-24T13:57:00Z"/>
   <w16cex:commentExtensible w16cex:durableId="5441F447" w16cex:dateUtc="2026-03-24T14:01:00Z"/>
   <w16cex:commentExtensible w16cex:durableId="6D1D4A8C" w16cex:dateUtc="2026-03-24T14:02:00Z"/>
+  <w16cex:commentExtensible w16cex:durableId="1769A3C4" w16cex:dateUtc="2026-03-24T14:09:00Z"/>
+  <w16cex:commentExtensible w16cex:durableId="38C5A3CB" w16cex:dateUtc="2026-03-24T14:11:00Z"/>
+  <w16cex:commentExtensible w16cex:durableId="79AE6EAE" w16cex:dateUtc="2026-03-24T14:15:00Z"/>
+  <w16cex:commentExtensible w16cex:durableId="016EEA41" w16cex:dateUtc="2026-03-24T14:17:00Z"/>
+  <w16cex:commentExtensible w16cex:durableId="7DBB4ADE" w16cex:dateUtc="2026-03-24T14:20:00Z"/>
+  <w16cex:commentExtensible w16cex:durableId="576C22F0" w16cex:dateUtc="2026-03-24T14:19:00Z"/>
+  <w16cex:commentExtensible w16cex:durableId="7A1B9B72" w16cex:dateUtc="2026-03-24T14:22:00Z"/>
+  <w16cex:commentExtensible w16cex:durableId="13E2C108" w16cex:dateUtc="2026-03-24T14:25:00Z"/>
 </w16cex:commentsExtensible>
 </file>
 
@@ -1461,6 +1988,14 @@
   <w16cid:commentId w16cid:paraId="7C37E974" w16cid:durableId="650090B1"/>
   <w16cid:commentId w16cid:paraId="77C467A3" w16cid:durableId="5441F447"/>
   <w16cid:commentId w16cid:paraId="585E9004" w16cid:durableId="6D1D4A8C"/>
+  <w16cid:commentId w16cid:paraId="5D1158DD" w16cid:durableId="1769A3C4"/>
+  <w16cid:commentId w16cid:paraId="7624117C" w16cid:durableId="38C5A3CB"/>
+  <w16cid:commentId w16cid:paraId="402D0F2C" w16cid:durableId="79AE6EAE"/>
+  <w16cid:commentId w16cid:paraId="5DBB9EB2" w16cid:durableId="016EEA41"/>
+  <w16cid:commentId w16cid:paraId="59C469B7" w16cid:durableId="7DBB4ADE"/>
+  <w16cid:commentId w16cid:paraId="068C2E61" w16cid:durableId="576C22F0"/>
+  <w16cid:commentId w16cid:paraId="65049884" w16cid:durableId="7A1B9B72"/>
+  <w16cid:commentId w16cid:paraId="52B940F2" w16cid:durableId="13E2C108"/>
 </w16cid:commentsIds>
 </file>
 

</xml_diff>